<commit_message>
feat: Material 3 icons + motion across site, monochrome-safe
- Replace all Font Awesome icons with Material Symbols Rounded (variable font)
  across home, proof, moments, and admin panel; drop the FA CDN entirely.
  Devicon kept for tech brand logos (no M3 equivalent).
- Add M3 motion tokens (standard/decelerate easing, short/medium/long duration),
  ripple state layer on buttons, and card entry animations.
- Animated theme switch: circular reveal from the toggle button via the
  View Transitions API, with graceful fallback to the existing CSS transition.
- Honour prefers-reduced-motion throughout.
- Admin panel: drop indigo accent so it matches the site's monochromatic glass UI.
- Update CV to Full Stack version (Indotech as Jun-Aug 2026, coursework added).
- gitignore *.mp3 (copyrighted audio must not ship in a public repo).
</commit_message>
<xml_diff>
--- a/cv/CV_Fakhrul_Mukhlisin_2026.docx
+++ b/cv/CV_Fakhrul_Mukhlisin_2026.docx
@@ -52,7 +52,7 @@
         <w:spacing w:after="40"/>
         <w:jc w:val="center"/>
       </w:pPr>
-      <w:hyperlink w:history="1" r:id="rId5jia_lj4oem8_auivpxtt">
+      <w:hyperlink w:history="1" r:id="rIdderxfxcx3hyvxv9ker6m0">
         <w:r>
           <w:rPr>
             <w:rStyle w:val="Hyperlink"/>
@@ -72,7 +72,7 @@
         </w:rPr>
         <w:t xml:space="preserve">  -  </w:t>
       </w:r>
-      <w:hyperlink w:history="1" r:id="rIdigzp__skmdh-vkbfdafdb">
+      <w:hyperlink w:history="1" r:id="rIdnbut3ymvb3ndzgtaizynl">
         <w:r>
           <w:rPr>
             <w:rStyle w:val="Hyperlink"/>
@@ -92,7 +92,7 @@
         </w:rPr>
         <w:t xml:space="preserve">  -  </w:t>
       </w:r>
-      <w:hyperlink w:history="1" r:id="rIdzuhbvlxonrpjtvmizghuw">
+      <w:hyperlink w:history="1" r:id="rIdkmigrrcnbv3yqqyclknhq">
         <w:r>
           <w:rPr>
             <w:rStyle w:val="Hyperlink"/>
@@ -109,7 +109,7 @@
         <w:pBdr>
           <w:bottom w:val="single" w:color="1F4E79" w:sz="6" w:space="2"/>
         </w:pBdr>
-        <w:spacing w:after="38" w:before="95"/>
+        <w:spacing w:after="30" w:before="76"/>
       </w:pPr>
       <w:r>
         <w:rPr>
@@ -133,7 +133,7 @@
           <w:sz w:val="18"/>
           <w:szCs w:val="18"/>
         </w:rPr>
-        <w:t xml:space="preserve">Information Systems student (GPA 3.68/4.0) building production web applications end to end. Currently a Full Stack Developer Intern at PT Indotech Digital, working in Laravel. Shipped a marketplace REST API in Golang (90.91/100) and an e-commerce catalog in Vue.js (87.79/100), and placed 5th of 926 in a Yandex machine-learning competition. BNSP-certified Web Developer.</w:t>
+        <w:t xml:space="preserve">Information Systems student (GPA 3.68/4.0) who ships production web applications end to end. Most recently a Full Stack Developer Intern at PT Indotech Digital, where 20+ pull requests were merged to a live Laravel platform. Previously built a marketplace REST API in Golang (90.91/100) and an e-commerce catalog in Vue.js (87.79/100), and placed 5th of 926 in a Yandex machine-learning competition. BNSP-certified Web Developer.</w:t>
       </w:r>
     </w:p>
     <w:p>
@@ -141,7 +141,7 @@
         <w:pBdr>
           <w:bottom w:val="single" w:color="1F4E79" w:sz="6" w:space="2"/>
         </w:pBdr>
-        <w:spacing w:after="38" w:before="95"/>
+        <w:spacing w:after="30" w:before="76"/>
       </w:pPr>
       <w:r>
         <w:rPr>
@@ -267,7 +267,7 @@
           <w:sz w:val="18"/>
           <w:szCs w:val="18"/>
         </w:rPr>
-        <w:t xml:space="preserve">Git, GitHub, GitLab CI/CD, Postman, Figma</w:t>
+        <w:t xml:space="preserve">Git &amp; PR review, GitHub, GitLab CI/CD, Postman, WSL, Figma</w:t>
       </w:r>
     </w:p>
     <w:p>
@@ -290,7 +290,7 @@
           <w:sz w:val="18"/>
           <w:szCs w:val="18"/>
         </w:rPr>
-        <w:t xml:space="preserve">Prompt Engineering, Azure OpenAI, Huawei Cloud (HCIA)</w:t>
+        <w:t xml:space="preserve">AI-assisted development workflow, Prompt Engineering, Azure OpenAI, Huawei Cloud (HCIA)</w:t>
       </w:r>
     </w:p>
     <w:p>
@@ -298,7 +298,7 @@
         <w:pBdr>
           <w:bottom w:val="single" w:color="1F4E79" w:sz="6" w:space="2"/>
         </w:pBdr>
-        <w:spacing w:after="38" w:before="95"/>
+        <w:spacing w:after="30" w:before="76"/>
       </w:pPr>
       <w:r>
         <w:rPr>
@@ -317,7 +317,7 @@
         <w:tabs>
           <w:tab w:val="right" w:pos="9026"/>
         </w:tabs>
-        <w:spacing w:after="8" w:before="62"/>
+        <w:spacing w:after="7" w:before="56"/>
       </w:pPr>
       <w:r>
         <w:rPr>
@@ -338,7 +338,7 @@
           <w:sz w:val="18"/>
           <w:szCs w:val="18"/>
         </w:rPr>
-        <w:t xml:space="preserve">	Jun 2026 - Present</w:t>
+        <w:t xml:space="preserve">	Jun - Aug 2026</w:t>
       </w:r>
     </w:p>
     <w:p>
@@ -363,69 +363,69 @@
           <w:ilvl w:val="0"/>
           <w:numId w:val="2"/>
         </w:numPr>
-        <w:spacing w:after="12"/>
-      </w:pPr>
-      <w:r>
-        <w:rPr>
-          <w:rFonts w:ascii="Arial" w:cs="Arial" w:eastAsia="Arial" w:hAnsi="Arial"/>
-          <w:sz w:val="18"/>
-          <w:szCs w:val="18"/>
-        </w:rPr>
-        <w:t xml:space="preserve">Building production features for Nobel Akademi, a Learning Management System, as part of the IT team.</w:t>
-      </w:r>
-    </w:p>
-    <w:p>
-      <w:pPr>
-        <w:pStyle w:val="ListParagraph"/>
-        <w:numPr>
-          <w:ilvl w:val="0"/>
-          <w:numId w:val="2"/>
-        </w:numPr>
-        <w:spacing w:after="12"/>
-      </w:pPr>
-      <w:r>
-        <w:rPr>
-          <w:rFonts w:ascii="Arial" w:cs="Arial" w:eastAsia="Arial" w:hAnsi="Arial"/>
-          <w:sz w:val="18"/>
-          <w:szCs w:val="18"/>
-        </w:rPr>
-        <w:t xml:space="preserve">Built the Bootcamp module end-to-end in Laravel 11 - normalized data model (6 related tables), backend logic, an admin CMS, and public listing &amp; detail pages.</w:t>
-      </w:r>
-    </w:p>
-    <w:p>
-      <w:pPr>
-        <w:pStyle w:val="ListParagraph"/>
-        <w:numPr>
-          <w:ilvl w:val="0"/>
-          <w:numId w:val="2"/>
-        </w:numPr>
-        <w:spacing w:after="12"/>
-      </w:pPr>
-      <w:r>
-        <w:rPr>
-          <w:rFonts w:ascii="Arial" w:cs="Arial" w:eastAsia="Arial" w:hAnsi="Arial"/>
-          <w:sz w:val="18"/>
-          <w:szCs w:val="18"/>
-        </w:rPr>
-        <w:t xml:space="preserve">Optimized data access with eager-loaded Eloquent relations (avoiding N+1 queries); implemented slug routing, YouTube embeds, and program ratings.</w:t>
-      </w:r>
-    </w:p>
-    <w:p>
-      <w:pPr>
-        <w:pStyle w:val="ListParagraph"/>
-        <w:numPr>
-          <w:ilvl w:val="0"/>
-          <w:numId w:val="2"/>
-        </w:numPr>
-        <w:spacing w:after="12"/>
-      </w:pPr>
-      <w:r>
-        <w:rPr>
-          <w:rFonts w:ascii="Arial" w:cs="Arial" w:eastAsia="Arial" w:hAnsi="Arial"/>
-          <w:sz w:val="18"/>
-          <w:szCs w:val="18"/>
-        </w:rPr>
-        <w:t xml:space="preserve">Collaborated through a team Git workflow - feature branches, pull requests, and code review.</w:t>
+        <w:spacing w:after="10"/>
+      </w:pPr>
+      <w:r>
+        <w:rPr>
+          <w:rFonts w:ascii="Arial" w:cs="Arial" w:eastAsia="Arial" w:hAnsi="Arial"/>
+          <w:sz w:val="18"/>
+          <w:szCs w:val="18"/>
+        </w:rPr>
+        <w:t xml:space="preserve">Shipped features to Nobel Akademi, a live Learning Management System - 20+ pull requests merged to production through a dev to staging to main review flow.</w:t>
+      </w:r>
+    </w:p>
+    <w:p>
+      <w:pPr>
+        <w:pStyle w:val="ListParagraph"/>
+        <w:numPr>
+          <w:ilvl w:val="0"/>
+          <w:numId w:val="2"/>
+        </w:numPr>
+        <w:spacing w:after="10"/>
+      </w:pPr>
+      <w:r>
+        <w:rPr>
+          <w:rFonts w:ascii="Arial" w:cs="Arial" w:eastAsia="Arial" w:hAnsi="Arial"/>
+          <w:sz w:val="18"/>
+          <w:szCs w:val="18"/>
+        </w:rPr>
+        <w:t xml:space="preserve">Built the Bootcamp module end-to-end in Laravel 11: normalized data model (6 related tables), backend logic, admin CMS, and public listing &amp; detail pages; eager-loaded Eloquent relations to avoid N+1 queries.</w:t>
+      </w:r>
+    </w:p>
+    <w:p>
+      <w:pPr>
+        <w:pStyle w:val="ListParagraph"/>
+        <w:numPr>
+          <w:ilvl w:val="0"/>
+          <w:numId w:val="2"/>
+        </w:numPr>
+        <w:spacing w:after="10"/>
+      </w:pPr>
+      <w:r>
+        <w:rPr>
+          <w:rFonts w:ascii="Arial" w:cs="Arial" w:eastAsia="Arial" w:hAnsi="Arial"/>
+          <w:sz w:val="18"/>
+          <w:szCs w:val="18"/>
+        </w:rPr>
+        <w:t xml:space="preserve">Delivered the Webinar module (registration flow, Mailable confirmation emails) plus e-portfolio and certification pages.</w:t>
+      </w:r>
+    </w:p>
+    <w:p>
+      <w:pPr>
+        <w:pStyle w:val="ListParagraph"/>
+        <w:numPr>
+          <w:ilvl w:val="0"/>
+          <w:numId w:val="2"/>
+        </w:numPr>
+        <w:spacing w:after="10"/>
+      </w:pPr>
+      <w:r>
+        <w:rPr>
+          <w:rFonts w:ascii="Arial" w:cs="Arial" w:eastAsia="Arial" w:hAnsi="Arial"/>
+          <w:sz w:val="18"/>
+          <w:szCs w:val="18"/>
+        </w:rPr>
+        <w:t xml:space="preserve">Diagnosed a production defect to root cause - a corrupted vendor asset silently halted JavaScript execution - and hardened the page so one failing library cannot break unrelated features.</w:t>
       </w:r>
     </w:p>
     <w:p>
@@ -433,7 +433,7 @@
         <w:tabs>
           <w:tab w:val="right" w:pos="9026"/>
         </w:tabs>
-        <w:spacing w:after="8" w:before="62"/>
+        <w:spacing w:after="7" w:before="56"/>
       </w:pPr>
       <w:r>
         <w:rPr>
@@ -479,7 +479,7 @@
           <w:ilvl w:val="0"/>
           <w:numId w:val="2"/>
         </w:numPr>
-        <w:spacing w:after="12"/>
+        <w:spacing w:after="10"/>
       </w:pPr>
       <w:r>
         <w:rPr>
@@ -497,7 +497,7 @@
           <w:ilvl w:val="0"/>
           <w:numId w:val="2"/>
         </w:numPr>
-        <w:spacing w:after="12"/>
+        <w:spacing w:after="10"/>
       </w:pPr>
       <w:r>
         <w:rPr>
@@ -507,7 +507,7 @@
         </w:rPr>
         <w:t xml:space="preserve">Implemented JWT auth, RBAC, multi-image upload, pagination, price-range filtering, and atomic DB transactions. Score: 90.91/100 (Excellent). </w:t>
       </w:r>
-      <w:hyperlink w:history="1" r:id="rId42m7zdb5v3wti0mdqtd6c">
+      <w:hyperlink w:history="1" r:id="rIdy0g0vv95ztjzkfjfg63os">
         <w:r>
           <w:rPr>
             <w:rStyle w:val="Hyperlink"/>
@@ -524,7 +524,7 @@
         <w:tabs>
           <w:tab w:val="right" w:pos="9026"/>
         </w:tabs>
-        <w:spacing w:after="8" w:before="62"/>
+        <w:spacing w:after="7" w:before="56"/>
       </w:pPr>
       <w:r>
         <w:rPr>
@@ -570,7 +570,7 @@
           <w:ilvl w:val="0"/>
           <w:numId w:val="2"/>
         </w:numPr>
-        <w:spacing w:after="12"/>
+        <w:spacing w:after="10"/>
       </w:pPr>
       <w:r>
         <w:rPr>
@@ -588,7 +588,7 @@
           <w:ilvl w:val="0"/>
           <w:numId w:val="2"/>
         </w:numPr>
-        <w:spacing w:after="12"/>
+        <w:spacing w:after="10"/>
       </w:pPr>
       <w:r>
         <w:rPr>
@@ -598,7 +598,7 @@
         </w:rPr>
         <w:t xml:space="preserve">Delivered a pixel-perfect Figma implementation and deployed via CI/CD. Score: 87.79/100 (Excellent). </w:t>
       </w:r>
-      <w:hyperlink w:history="1" r:id="rIdrruzbfutiajuao7ncjsge">
+      <w:hyperlink w:history="1" r:id="rIdwsafezweqrsl8wyvucle9">
         <w:r>
           <w:rPr>
             <w:rStyle w:val="Hyperlink"/>
@@ -615,7 +615,7 @@
         <w:tabs>
           <w:tab w:val="right" w:pos="9026"/>
         </w:tabs>
-        <w:spacing w:after="8" w:before="62"/>
+        <w:spacing w:after="7" w:before="56"/>
       </w:pPr>
       <w:r>
         <w:rPr>
@@ -661,7 +661,7 @@
           <w:ilvl w:val="0"/>
           <w:numId w:val="2"/>
         </w:numPr>
-        <w:spacing w:after="12"/>
+        <w:spacing w:after="10"/>
       </w:pPr>
       <w:r>
         <w:rPr>
@@ -679,7 +679,7 @@
           <w:ilvl w:val="0"/>
           <w:numId w:val="2"/>
         </w:numPr>
-        <w:spacing w:after="12"/>
+        <w:spacing w:after="10"/>
       </w:pPr>
       <w:r>
         <w:rPr>
@@ -689,7 +689,7 @@
         </w:rPr>
         <w:t xml:space="preserve">Built a digital archive for 1,000+ files and data visualizations for faculty presentations. Predikat: Sangat Baik. </w:t>
       </w:r>
-      <w:hyperlink w:history="1" r:id="rIdj3wphwbzzn5fgpx0p8h2x">
+      <w:hyperlink w:history="1" r:id="rIdydainsvvbvicjcgufvyqw">
         <w:r>
           <w:rPr>
             <w:rStyle w:val="Hyperlink"/>
@@ -706,7 +706,7 @@
         <w:pBdr>
           <w:bottom w:val="single" w:color="1F4E79" w:sz="6" w:space="2"/>
         </w:pBdr>
-        <w:spacing w:after="38" w:before="95"/>
+        <w:spacing w:after="30" w:before="76"/>
       </w:pPr>
       <w:r>
         <w:rPr>
@@ -725,7 +725,7 @@
         <w:tabs>
           <w:tab w:val="right" w:pos="9026"/>
         </w:tabs>
-        <w:spacing w:after="8" w:before="62"/>
+        <w:spacing w:after="7" w:before="56"/>
       </w:pPr>
       <w:r>
         <w:rPr>
@@ -764,7 +764,7 @@
     </w:p>
     <w:p>
       <w:pPr>
-        <w:spacing w:after="14"/>
+        <w:spacing w:after="6"/>
       </w:pPr>
       <w:r>
         <w:rPr>
@@ -776,7 +776,7 @@
         </w:rPr>
         <w:t xml:space="preserve">Published: "Penerapan Metode SAW Penerima BLT Berbasis Web pada Kantor Desa Waru Jaya" - </w:t>
       </w:r>
-      <w:hyperlink w:history="1" r:id="rIdmcdcikeishms2uvgvuthb">
+      <w:hyperlink w:history="1" r:id="rIdfttd58fijrebtehwuilsa">
         <w:r>
           <w:rPr>
             <w:rStyle w:val="Hyperlink"/>
@@ -792,10 +792,23 @@
     </w:p>
     <w:p>
       <w:pPr>
+        <w:spacing w:after="12"/>
+      </w:pPr>
+      <w:r>
+        <w:rPr>
+          <w:rFonts w:ascii="Arial" w:cs="Arial" w:eastAsia="Arial" w:hAnsi="Arial"/>
+          <w:sz w:val="17"/>
+          <w:szCs w:val="17"/>
+        </w:rPr>
+        <w:t xml:space="preserve">Relevant coursework: Systems Analysis &amp; Design, Software Quality Assurance, Information Security, Database Design, Algorithms &amp; Data Structures, Cloud Computing.</w:t>
+      </w:r>
+    </w:p>
+    <w:p>
+      <w:pPr>
         <w:pBdr>
           <w:bottom w:val="single" w:color="1F4E79" w:sz="6" w:space="2"/>
         </w:pBdr>
-        <w:spacing w:after="38" w:before="95"/>
+        <w:spacing w:after="30" w:before="76"/>
       </w:pPr>
       <w:r>
         <w:rPr>
@@ -816,9 +829,9 @@
           <w:ilvl w:val="0"/>
           <w:numId w:val="2"/>
         </w:numPr>
-        <w:spacing w:after="12"/>
-      </w:pPr>
-      <w:hyperlink w:history="1" r:id="rIdxlhg64wehiuqmj0cmreua">
+        <w:spacing w:after="10"/>
+      </w:pPr>
+      <w:hyperlink w:history="1" r:id="rIdhhuwyxkssatpeyygchivn">
         <w:r>
           <w:rPr>
             <w:rStyle w:val="Hyperlink"/>
@@ -845,9 +858,9 @@
           <w:ilvl w:val="0"/>
           <w:numId w:val="2"/>
         </w:numPr>
-        <w:spacing w:after="12"/>
-      </w:pPr>
-      <w:hyperlink w:history="1" r:id="rId01hkv5861eve3kvdxoyl2">
+        <w:spacing w:after="10"/>
+      </w:pPr>
+      <w:hyperlink w:history="1" r:id="rIdceovu0h-soad8mekfdlxs">
         <w:r>
           <w:rPr>
             <w:rStyle w:val="Hyperlink"/>
@@ -874,9 +887,9 @@
           <w:ilvl w:val="0"/>
           <w:numId w:val="2"/>
         </w:numPr>
-        <w:spacing w:after="12"/>
-      </w:pPr>
-      <w:hyperlink w:history="1" r:id="rIdwyafnralbwnomlhsfzcfi">
+        <w:spacing w:after="10"/>
+      </w:pPr>
+      <w:hyperlink w:history="1" r:id="rIdl2iw2lzrcv5x90e1od_vz">
         <w:r>
           <w:rPr>
             <w:rStyle w:val="Hyperlink"/>
@@ -903,9 +916,9 @@
           <w:ilvl w:val="0"/>
           <w:numId w:val="2"/>
         </w:numPr>
-        <w:spacing w:after="12"/>
-      </w:pPr>
-      <w:hyperlink w:history="1" r:id="rIdh1txn1hmystvh5cbebhab">
+        <w:spacing w:after="10"/>
+      </w:pPr>
+      <w:hyperlink w:history="1" r:id="rId1uwl_feuo5b-dwwtqc0y8">
         <w:r>
           <w:rPr>
             <w:rStyle w:val="Hyperlink"/>
@@ -932,9 +945,9 @@
           <w:ilvl w:val="0"/>
           <w:numId w:val="2"/>
         </w:numPr>
-        <w:spacing w:after="12"/>
-      </w:pPr>
-      <w:hyperlink w:history="1" r:id="rId1yzjy4t9d_nsjg5fvka4b">
+        <w:spacing w:after="10"/>
+      </w:pPr>
+      <w:hyperlink w:history="1" r:id="rIdcelw1u9awtuobhwqyumf2">
         <w:r>
           <w:rPr>
             <w:rStyle w:val="Hyperlink"/>
@@ -961,9 +974,9 @@
           <w:ilvl w:val="0"/>
           <w:numId w:val="2"/>
         </w:numPr>
-        <w:spacing w:after="12"/>
-      </w:pPr>
-      <w:hyperlink w:history="1" r:id="rIdwlnzcdq4hcizmyufdlvls">
+        <w:spacing w:after="10"/>
+      </w:pPr>
+      <w:hyperlink w:history="1" r:id="rIdnj_hnafpxuwpdyop2eax5">
         <w:r>
           <w:rPr>
             <w:rStyle w:val="Hyperlink"/>
@@ -988,7 +1001,7 @@
         <w:pBdr>
           <w:bottom w:val="single" w:color="1F4E79" w:sz="6" w:space="2"/>
         </w:pBdr>
-        <w:spacing w:after="38" w:before="95"/>
+        <w:spacing w:after="30" w:before="76"/>
       </w:pPr>
       <w:r>
         <w:rPr>
@@ -1007,7 +1020,7 @@
         <w:tabs>
           <w:tab w:val="right" w:pos="9026"/>
         </w:tabs>
-        <w:spacing w:after="8" w:before="62"/>
+        <w:spacing w:after="7" w:before="56"/>
       </w:pPr>
       <w:r>
         <w:rPr>
@@ -1038,7 +1051,7 @@
           <w:ilvl w:val="0"/>
           <w:numId w:val="2"/>
         </w:numPr>
-        <w:spacing w:after="12"/>
+        <w:spacing w:after="10"/>
       </w:pPr>
       <w:r>
         <w:rPr>
@@ -1054,7 +1067,7 @@
         <w:pBdr>
           <w:bottom w:val="single" w:color="1F4E79" w:sz="6" w:space="2"/>
         </w:pBdr>
-        <w:spacing w:after="38" w:before="95"/>
+        <w:spacing w:after="30" w:before="76"/>
       </w:pPr>
       <w:r>
         <w:rPr>
@@ -1111,7 +1124,7 @@
           <w:sz w:val="18"/>
           <w:szCs w:val="18"/>
         </w:rPr>
-        <w:t xml:space="preserve">Full-time, internship, or part-time - remote or Jakarta area; open to relocation.</w:t>
+        <w:t xml:space="preserve">Available immediately - full-time, part-time, or internship; remote or Jakarta / Depok / Tangerang.</w:t>
       </w:r>
     </w:p>
     <w:sectPr>

</xml_diff>

<commit_message>
fix: update hero-bio/experience tense for continued contract; add ENSA cert; append Fase 3 spec (T9-T16)
- index.html: "Available now" -> "Open to full-time opportunities alongside my current internship"; "Jun - Aug 2026" -> "Jun 2026 - Present" to reflect contract extension
- data/proof-data.json: add Cisco ENSA certification entry
- REDESIGN_SPEC.md: append Fase 3 spec (T9-T16) adapting Renlenon reference (featured build spotlight, case-study template, skills chip list, visitor counter, etc.)
</commit_message>
<xml_diff>
--- a/cv/CV_Fakhrul_Mukhlisin_2026.docx
+++ b/cv/CV_Fakhrul_Mukhlisin_2026.docx
@@ -52,7 +52,7 @@
         <w:spacing w:after="40"/>
         <w:jc w:val="center"/>
       </w:pPr>
-      <w:hyperlink w:history="1" r:id="rIdderxfxcx3hyvxv9ker6m0">
+      <w:hyperlink w:history="1" r:id="rIdbmr2urk16b0v8wmm3vhab">
         <w:r>
           <w:rPr>
             <w:rStyle w:val="Hyperlink"/>
@@ -72,7 +72,7 @@
         </w:rPr>
         <w:t xml:space="preserve">  -  </w:t>
       </w:r>
-      <w:hyperlink w:history="1" r:id="rIdnbut3ymvb3ndzgtaizynl">
+      <w:hyperlink w:history="1" r:id="rIdzjrv-jurrpgey1entfwy1">
         <w:r>
           <w:rPr>
             <w:rStyle w:val="Hyperlink"/>
@@ -92,7 +92,7 @@
         </w:rPr>
         <w:t xml:space="preserve">  -  </w:t>
       </w:r>
-      <w:hyperlink w:history="1" r:id="rIdkmigrrcnbv3yqqyclknhq">
+      <w:hyperlink w:history="1" r:id="rId5rxwns0vv0tpalkbv9vta">
         <w:r>
           <w:rPr>
             <w:rStyle w:val="Hyperlink"/>
@@ -133,7 +133,7 @@
           <w:sz w:val="18"/>
           <w:szCs w:val="18"/>
         </w:rPr>
-        <w:t xml:space="preserve">Information Systems student (GPA 3.68/4.0) who ships production web applications end to end. Most recently a Full Stack Developer Intern at PT Indotech Digital, where 20+ pull requests were merged to a live Laravel platform. Previously built a marketplace REST API in Golang (90.91/100) and an e-commerce catalog in Vue.js (87.79/100), and placed 5th of 926 in a Yandex machine-learning competition. BNSP-certified Web Developer.</w:t>
+        <w:t xml:space="preserve">Information Systems student (GPA 3.68/4.0) who ships production web applications end to end. Currently a Full Stack Developer Intern at PT Indotech Digital, where 20+ pull requests have been merged to a live Laravel platform. Previously built a marketplace REST API in Golang (90.91/100) and an e-commerce catalog in Vue.js (87.79/100), and placed 5th of 926 in a Yandex machine-learning competition. BNSP-certified Web Developer.</w:t>
       </w:r>
     </w:p>
     <w:p>
@@ -338,7 +338,7 @@
           <w:sz w:val="18"/>
           <w:szCs w:val="18"/>
         </w:rPr>
-        <w:t xml:space="preserve">	Jun - Aug 2026</w:t>
+        <w:t xml:space="preserve">	Jun 2026 - Present</w:t>
       </w:r>
     </w:p>
     <w:p>
@@ -371,7 +371,7 @@
           <w:sz w:val="18"/>
           <w:szCs w:val="18"/>
         </w:rPr>
-        <w:t xml:space="preserve">Shipped features to Nobel Akademi, a live Learning Management System - 20+ pull requests merged to production through a dev to staging to main review flow.</w:t>
+        <w:t xml:space="preserve">Ship features to Nobel Akademi, a live Learning Management System - 20+ pull requests merged to production through a dev to staging to main review flow.</w:t>
       </w:r>
     </w:p>
     <w:p>
@@ -507,7 +507,7 @@
         </w:rPr>
         <w:t xml:space="preserve">Implemented JWT auth, RBAC, multi-image upload, pagination, price-range filtering, and atomic DB transactions. Score: 90.91/100 (Excellent). </w:t>
       </w:r>
-      <w:hyperlink w:history="1" r:id="rIdy0g0vv95ztjzkfjfg63os">
+      <w:hyperlink w:history="1" r:id="rIdf3jpxkix9po8tgkwblg9f">
         <w:r>
           <w:rPr>
             <w:rStyle w:val="Hyperlink"/>
@@ -598,7 +598,7 @@
         </w:rPr>
         <w:t xml:space="preserve">Delivered a pixel-perfect Figma implementation and deployed via CI/CD. Score: 87.79/100 (Excellent). </w:t>
       </w:r>
-      <w:hyperlink w:history="1" r:id="rIdwsafezweqrsl8wyvucle9">
+      <w:hyperlink w:history="1" r:id="rIdvuvks0irg_qiwzhvygntc">
         <w:r>
           <w:rPr>
             <w:rStyle w:val="Hyperlink"/>
@@ -689,7 +689,7 @@
         </w:rPr>
         <w:t xml:space="preserve">Built a digital archive for 1,000+ files and data visualizations for faculty presentations. Predikat: Sangat Baik. </w:t>
       </w:r>
-      <w:hyperlink w:history="1" r:id="rIdydainsvvbvicjcgufvyqw">
+      <w:hyperlink w:history="1" r:id="rIditt1stnzh3vgdhukyeltt">
         <w:r>
           <w:rPr>
             <w:rStyle w:val="Hyperlink"/>
@@ -776,7 +776,7 @@
         </w:rPr>
         <w:t xml:space="preserve">Published: "Penerapan Metode SAW Penerima BLT Berbasis Web pada Kantor Desa Waru Jaya" - </w:t>
       </w:r>
-      <w:hyperlink w:history="1" r:id="rIdfttd58fijrebtehwuilsa">
+      <w:hyperlink w:history="1" r:id="rId7akafmdlwsryxzcbxf0-8">
         <w:r>
           <w:rPr>
             <w:rStyle w:val="Hyperlink"/>
@@ -831,7 +831,7 @@
         </w:numPr>
         <w:spacing w:after="10"/>
       </w:pPr>
-      <w:hyperlink w:history="1" r:id="rIdhhuwyxkssatpeyygchivn">
+      <w:hyperlink w:history="1" r:id="rIdtbaufiq3apniq3jxyz7ez">
         <w:r>
           <w:rPr>
             <w:rStyle w:val="Hyperlink"/>
@@ -848,19 +848,19 @@
           <w:sz w:val="18"/>
           <w:szCs w:val="18"/>
         </w:rPr>
-        <w:t xml:space="preserve"> (BPPTIK Kominfo, Digitalent Scholarship) - Aug 2023</w:t>
-      </w:r>
-    </w:p>
-    <w:p>
-      <w:pPr>
-        <w:pStyle w:val="ListParagraph"/>
-        <w:numPr>
-          <w:ilvl w:val="0"/>
-          <w:numId w:val="2"/>
-        </w:numPr>
-        <w:spacing w:after="10"/>
-      </w:pPr>
-      <w:hyperlink w:history="1" r:id="rIdceovu0h-soad8mekfdlxs">
+        <w:t xml:space="preserve"> (BPPTIK Kominfo, Digitalent Scholarship) - Aug 2023 - Aug 2026</w:t>
+      </w:r>
+    </w:p>
+    <w:p>
+      <w:pPr>
+        <w:pStyle w:val="ListParagraph"/>
+        <w:numPr>
+          <w:ilvl w:val="0"/>
+          <w:numId w:val="2"/>
+        </w:numPr>
+        <w:spacing w:after="10"/>
+      </w:pPr>
+      <w:hyperlink w:history="1" r:id="rIdpz517aojufxvx1ofeh91q">
         <w:r>
           <w:rPr>
             <w:rStyle w:val="Hyperlink"/>
@@ -889,7 +889,7 @@
         </w:numPr>
         <w:spacing w:after="10"/>
       </w:pPr>
-      <w:hyperlink w:history="1" r:id="rIdl2iw2lzrcv5x90e1od_vz">
+      <w:hyperlink w:history="1" r:id="rIdkw-bvv65o3nnfv3_rvwmg">
         <w:r>
           <w:rPr>
             <w:rStyle w:val="Hyperlink"/>
@@ -918,7 +918,7 @@
         </w:numPr>
         <w:spacing w:after="10"/>
       </w:pPr>
-      <w:hyperlink w:history="1" r:id="rId1uwl_feuo5b-dwwtqc0y8">
+      <w:hyperlink w:history="1" r:id="rIdjys8m-yodzsfdh24msssm">
         <w:r>
           <w:rPr>
             <w:rStyle w:val="Hyperlink"/>
@@ -947,7 +947,7 @@
         </w:numPr>
         <w:spacing w:after="10"/>
       </w:pPr>
-      <w:hyperlink w:history="1" r:id="rIdcelw1u9awtuobhwqyumf2">
+      <w:hyperlink w:history="1" r:id="rIdkuln_vuwdvdhy8wm4xrsw">
         <w:r>
           <w:rPr>
             <w:rStyle w:val="Hyperlink"/>
@@ -976,7 +976,7 @@
         </w:numPr>
         <w:spacing w:after="10"/>
       </w:pPr>
-      <w:hyperlink w:history="1" r:id="rIdnj_hnafpxuwpdyop2eax5">
+      <w:hyperlink w:history="1" r:id="rIdn1br5ccm7giaxvs9owa27">
         <w:r>
           <w:rPr>
             <w:rStyle w:val="Hyperlink"/>
@@ -1124,7 +1124,7 @@
           <w:sz w:val="18"/>
           <w:szCs w:val="18"/>
         </w:rPr>
-        <w:t xml:space="preserve">Available immediately - full-time, part-time, or internship; remote or Jakarta / Depok / Tangerang.</w:t>
+        <w:t xml:space="preserve">Currently interning (1 day/week onsite); open to full-time - remote or Jakarta / Depok / Tangerang.</w:t>
       </w:r>
     </w:p>
     <w:sectPr>

</xml_diff>